<commit_message>
Expand clothing service guide: wear periods, write-off, warehouse regime
Add chapters on storage regime, armature cards, branding/swap fund,
detailed wear periods, category III write-off, duty handover, and
document cheat-sheet with new diagrams; refresh Word and zip.

Co-authored-by: Aurora Dev <spawnwin@users.noreply.github.com>
</commit_message>
<xml_diff>
--- a/press/veshchevaya-metodichka/docx/Metodichka_veshchevaya_sluzhba_VS_RF.docx
+++ b/press/veshchevaya-metodichka/docx/Metodichka_veshchevaya_sluzhba_VS_RF.docx
@@ -1020,7 +1020,604 @@
           <w:color w:val="000000"/>
           <w:sz w:val="32"/>
         </w:rPr>
-        <w:t>11. Источники</w:t>
+        <w:t>11. Режим вещевого склада</w:t>
+      </w:r>
+    </w:p>
+    <w:p>
+      <w:pPr>
+        <w:pStyle w:val="ListBullet"/>
+      </w:pPr>
+      <w:r>
+        <w:rPr>
+          <w:rFonts w:ascii="Times New Roman" w:hAnsi="Times New Roman" w:eastAsia="Times New Roman"/>
+          <w:b w:val="0"/>
+          <w:color w:val="000000"/>
+          <w:sz w:val="24"/>
+        </w:rPr>
+        <w:t>Паспорт склада: площадь, кубатура, вместимость, нагрузка на пол, режим работы.</w:t>
+      </w:r>
+    </w:p>
+    <w:p>
+      <w:pPr>
+        <w:pStyle w:val="ListBullet"/>
+      </w:pPr>
+      <w:r>
+        <w:rPr>
+          <w:rFonts w:ascii="Times New Roman" w:hAnsi="Times New Roman" w:eastAsia="Times New Roman"/>
+          <w:b w:val="0"/>
+          <w:color w:val="000000"/>
+          <w:sz w:val="24"/>
+        </w:rPr>
+        <w:t>План хранилища со схемой стеллажей и кладовых.</w:t>
+      </w:r>
+    </w:p>
+    <w:p>
+      <w:pPr>
+        <w:pStyle w:val="ListBullet"/>
+      </w:pPr>
+      <w:r>
+        <w:rPr>
+          <w:rFonts w:ascii="Times New Roman" w:hAnsi="Times New Roman" w:eastAsia="Times New Roman"/>
+          <w:b w:val="0"/>
+          <w:color w:val="000000"/>
+          <w:sz w:val="24"/>
+        </w:rPr>
+        <w:t>Журнал температуры и влажности; мокрое имущество не принимать.</w:t>
+      </w:r>
+    </w:p>
+    <w:p>
+      <w:pPr>
+        <w:pStyle w:val="ListBullet"/>
+      </w:pPr>
+      <w:r>
+        <w:rPr>
+          <w:rFonts w:ascii="Times New Roman" w:hAnsi="Times New Roman" w:eastAsia="Times New Roman"/>
+          <w:b w:val="0"/>
+          <w:color w:val="000000"/>
+          <w:sz w:val="24"/>
+        </w:rPr>
+        <w:t>Картотека на столе запирается; ключ у начальника склада.</w:t>
+      </w:r>
+    </w:p>
+    <w:p>
+      <w:pPr>
+        <w:pStyle w:val="ListBullet"/>
+      </w:pPr>
+      <w:r>
+        <w:rPr>
+          <w:rFonts w:ascii="Times New Roman" w:hAnsi="Times New Roman" w:eastAsia="Times New Roman"/>
+          <w:b w:val="0"/>
+          <w:color w:val="000000"/>
+          <w:sz w:val="24"/>
+        </w:rPr>
+        <w:t>Охрана, слепки, наружный рубильник, огнетушители, грозозащита.</w:t>
+      </w:r>
+    </w:p>
+    <w:p>
+      <w:r>
+        <w:drawing>
+          <wp:inline xmlns:a="http://schemas.openxmlformats.org/drawingml/2006/main" xmlns:pic="http://schemas.openxmlformats.org/drawingml/2006/picture">
+            <wp:extent cx="5669280" cy="3644537"/>
+            <wp:docPr id="8" name="Picture 8"/>
+            <wp:cNvGraphicFramePr>
+              <a:graphicFrameLocks noChangeAspect="1"/>
+            </wp:cNvGraphicFramePr>
+            <a:graphic>
+              <a:graphicData uri="http://schemas.openxmlformats.org/drawingml/2006/picture">
+                <pic:pic>
+                  <pic:nvPicPr>
+                    <pic:cNvPr id="0" name="12_rezhim_sklada.png"/>
+                    <pic:cNvPicPr/>
+                  </pic:nvPicPr>
+                  <pic:blipFill>
+                    <a:blip r:embed="rId16"/>
+                    <a:stretch>
+                      <a:fillRect/>
+                    </a:stretch>
+                  </pic:blipFill>
+                  <pic:spPr>
+                    <a:xfrm>
+                      <a:off x="0" y="0"/>
+                      <a:ext cx="5669280" cy="3644537"/>
+                    </a:xfrm>
+                    <a:prstGeom prst="rect"/>
+                  </pic:spPr>
+                </pic:pic>
+              </a:graphicData>
+            </a:graphic>
+          </wp:inline>
+        </w:drawing>
+      </w:r>
+    </w:p>
+    <w:p>
+      <w:pPr>
+        <w:jc w:val="center"/>
+      </w:pPr>
+      <w:r>
+        <w:rPr>
+          <w:rFonts w:ascii="Times New Roman" w:hAnsi="Times New Roman" w:eastAsia="Times New Roman"/>
+          <w:b w:val="0"/>
+          <w:i/>
+          <w:color w:val="000000"/>
+          <w:sz w:val="20"/>
+        </w:rPr>
+        <w:t>Рисунок 8. Режим вещевого склада</w:t>
+      </w:r>
+    </w:p>
+    <w:p>
+      <w:pPr>
+        <w:pStyle w:val="Heading1"/>
+      </w:pPr>
+      <w:r>
+        <w:rPr>
+          <w:rFonts w:ascii="Times New Roman" w:hAnsi="Times New Roman" w:eastAsia="Times New Roman"/>
+          <w:b/>
+          <w:color w:val="000000"/>
+          <w:sz w:val="32"/>
+        </w:rPr>
+        <w:t>12. Арматурная карточка</w:t>
+      </w:r>
+    </w:p>
+    <w:p>
+      <w:pPr>
+        <w:spacing w:after="120"/>
+        <w:ind w:firstLine="709"/>
+        <w:jc w:val="both"/>
+      </w:pPr>
+      <w:r>
+        <w:rPr>
+          <w:rFonts w:ascii="Times New Roman" w:hAnsi="Times New Roman" w:eastAsia="Times New Roman"/>
+          <w:b w:val="0"/>
+          <w:color w:val="000000"/>
+          <w:sz w:val="24"/>
+        </w:rPr>
+        <w:t>Арматурная карточка связывает ростовку, норму и фактическую выдачу. Вносятся установочные данные, замеры, сведения из аттестата ф. 21; по мере выдачи — предмет, дата, срок носки. Карточки группируют по подразделениям.</w:t>
+      </w:r>
+    </w:p>
+    <w:p>
+      <w:r>
+        <w:drawing>
+          <wp:inline xmlns:a="http://schemas.openxmlformats.org/drawingml/2006/main" xmlns:pic="http://schemas.openxmlformats.org/drawingml/2006/picture">
+            <wp:extent cx="5669280" cy="7086600"/>
+            <wp:docPr id="9" name="Picture 9"/>
+            <wp:cNvGraphicFramePr>
+              <a:graphicFrameLocks noChangeAspect="1"/>
+            </wp:cNvGraphicFramePr>
+            <a:graphic>
+              <a:graphicData uri="http://schemas.openxmlformats.org/drawingml/2006/picture">
+                <pic:pic>
+                  <pic:nvPicPr>
+                    <pic:cNvPr id="0" name="10_armaturnaya_kartochka.png"/>
+                    <pic:cNvPicPr/>
+                  </pic:nvPicPr>
+                  <pic:blipFill>
+                    <a:blip r:embed="rId17"/>
+                    <a:stretch>
+                      <a:fillRect/>
+                    </a:stretch>
+                  </pic:blipFill>
+                  <pic:spPr>
+                    <a:xfrm>
+                      <a:off x="0" y="0"/>
+                      <a:ext cx="5669280" cy="7086600"/>
+                    </a:xfrm>
+                    <a:prstGeom prst="rect"/>
+                  </pic:spPr>
+                </pic:pic>
+              </a:graphicData>
+            </a:graphic>
+          </wp:inline>
+        </w:drawing>
+      </w:r>
+    </w:p>
+    <w:p>
+      <w:pPr>
+        <w:jc w:val="center"/>
+      </w:pPr>
+      <w:r>
+        <w:rPr>
+          <w:rFonts w:ascii="Times New Roman" w:hAnsi="Times New Roman" w:eastAsia="Times New Roman"/>
+          <w:b w:val="0"/>
+          <w:i/>
+          <w:color w:val="000000"/>
+          <w:sz w:val="20"/>
+        </w:rPr>
+        <w:t>Рисунок 9. Учебный макет арматурной карточки</w:t>
+      </w:r>
+    </w:p>
+    <w:p>
+      <w:pPr>
+        <w:pStyle w:val="Heading1"/>
+      </w:pPr>
+      <w:r>
+        <w:rPr>
+          <w:rFonts w:ascii="Times New Roman" w:hAnsi="Times New Roman" w:eastAsia="Times New Roman"/>
+          <w:b/>
+          <w:color w:val="000000"/>
+          <w:sz w:val="32"/>
+        </w:rPr>
+        <w:t>13. Клеймение, подгонка, подменный фонд</w:t>
+      </w:r>
+    </w:p>
+    <w:p>
+      <w:pPr>
+        <w:pStyle w:val="ListBullet"/>
+      </w:pPr>
+      <w:r>
+        <w:rPr>
+          <w:rFonts w:ascii="Times New Roman" w:hAnsi="Times New Roman" w:eastAsia="Times New Roman"/>
+          <w:b w:val="0"/>
+          <w:color w:val="000000"/>
+          <w:sz w:val="24"/>
+        </w:rPr>
+        <w:t>При выдаче призывникам — подгонка и клеймение инвентаря.</w:t>
+      </w:r>
+    </w:p>
+    <w:p>
+      <w:pPr>
+        <w:pStyle w:val="ListBullet"/>
+      </w:pPr>
+      <w:r>
+        <w:rPr>
+          <w:rFonts w:ascii="Times New Roman" w:hAnsi="Times New Roman" w:eastAsia="Times New Roman"/>
+          <w:b w:val="0"/>
+          <w:color w:val="000000"/>
+          <w:sz w:val="24"/>
+        </w:rPr>
+        <w:t>Запас на сборных пунктах ≈ 10% потребности призыва.</w:t>
+      </w:r>
+    </w:p>
+    <w:p>
+      <w:pPr>
+        <w:pStyle w:val="ListBullet"/>
+      </w:pPr>
+      <w:r>
+        <w:rPr>
+          <w:rFonts w:ascii="Times New Roman" w:hAnsi="Times New Roman" w:eastAsia="Times New Roman"/>
+          <w:b w:val="0"/>
+          <w:color w:val="000000"/>
+          <w:sz w:val="24"/>
+        </w:rPr>
+        <w:t>Подменный фонд — из выслужившего срок, но годного имущества (в т. ч. после ремонта).</w:t>
+      </w:r>
+    </w:p>
+    <w:p>
+      <w:pPr>
+        <w:pStyle w:val="ListBullet"/>
+      </w:pPr>
+      <w:r>
+        <w:rPr>
+          <w:rFonts w:ascii="Times New Roman" w:hAnsi="Times New Roman" w:eastAsia="Times New Roman"/>
+          <w:b w:val="0"/>
+          <w:color w:val="000000"/>
+          <w:sz w:val="24"/>
+        </w:rPr>
+        <w:t>Рабочая одежда — не более 100% списочной численности призывников/курсантов.</w:t>
+      </w:r>
+    </w:p>
+    <w:p>
+      <w:pPr>
+        <w:pStyle w:val="ListBullet"/>
+      </w:pPr>
+      <w:r>
+        <w:rPr>
+          <w:rFonts w:ascii="Times New Roman" w:hAnsi="Times New Roman" w:eastAsia="Times New Roman"/>
+          <w:b w:val="0"/>
+          <w:color w:val="000000"/>
+          <w:sz w:val="24"/>
+        </w:rPr>
+        <w:t>Не смешивать подменный фонд с НЗ и III категорией.</w:t>
+      </w:r>
+    </w:p>
+    <w:p>
+      <w:pPr>
+        <w:pStyle w:val="Heading1"/>
+      </w:pPr>
+      <w:r>
+        <w:rPr>
+          <w:rFonts w:ascii="Times New Roman" w:hAnsi="Times New Roman" w:eastAsia="Times New Roman"/>
+          <w:b/>
+          <w:color w:val="000000"/>
+          <w:sz w:val="32"/>
+        </w:rPr>
+        <w:t>14. Сроки носки (подробно)</w:t>
+      </w:r>
+    </w:p>
+    <w:p>
+      <w:pPr>
+        <w:spacing w:after="120"/>
+        <w:ind w:firstLine="709"/>
+        <w:jc w:val="both"/>
+      </w:pPr>
+      <w:r>
+        <w:rPr>
+          <w:rFonts w:ascii="Times New Roman" w:hAnsi="Times New Roman" w:eastAsia="Times New Roman"/>
+          <w:b w:val="0"/>
+          <w:color w:val="000000"/>
+          <w:sz w:val="24"/>
+        </w:rPr>
+        <w:t>Срок зависит от нормы, категории военнослужащего и климата. Срок нового одноимённого предмета начинается со следующего дня после окончания срока предыдущего. В холодном климате срок костюма утеплённого уменьшается на 1 год, в жарком — увеличивается на 1 год (ориентир п. 62.1). Расходники на категории не делятся.</w:t>
+      </w:r>
+    </w:p>
+    <w:p>
+      <w:r>
+        <w:drawing>
+          <wp:inline xmlns:a="http://schemas.openxmlformats.org/drawingml/2006/main" xmlns:pic="http://schemas.openxmlformats.org/drawingml/2006/picture">
+            <wp:extent cx="5669280" cy="4454434"/>
+            <wp:docPr id="10" name="Picture 10"/>
+            <wp:cNvGraphicFramePr>
+              <a:graphicFrameLocks noChangeAspect="1"/>
+            </wp:cNvGraphicFramePr>
+            <a:graphic>
+              <a:graphicData uri="http://schemas.openxmlformats.org/drawingml/2006/picture">
+                <pic:pic>
+                  <pic:nvPicPr>
+                    <pic:cNvPr id="0" name="08_sroki_noski.png"/>
+                    <pic:cNvPicPr/>
+                  </pic:nvPicPr>
+                  <pic:blipFill>
+                    <a:blip r:embed="rId18"/>
+                    <a:stretch>
+                      <a:fillRect/>
+                    </a:stretch>
+                  </pic:blipFill>
+                  <pic:spPr>
+                    <a:xfrm>
+                      <a:off x="0" y="0"/>
+                      <a:ext cx="5669280" cy="4454434"/>
+                    </a:xfrm>
+                    <a:prstGeom prst="rect"/>
+                  </pic:spPr>
+                </pic:pic>
+              </a:graphicData>
+            </a:graphic>
+          </wp:inline>
+        </w:drawing>
+      </w:r>
+    </w:p>
+    <w:p>
+      <w:pPr>
+        <w:jc w:val="center"/>
+      </w:pPr>
+      <w:r>
+        <w:rPr>
+          <w:rFonts w:ascii="Times New Roman" w:hAnsi="Times New Roman" w:eastAsia="Times New Roman"/>
+          <w:b w:val="0"/>
+          <w:i/>
+          <w:color w:val="000000"/>
+          <w:sz w:val="20"/>
+        </w:rPr>
+        <w:t>Рисунок 10. Ориентиры сроков носки</w:t>
+      </w:r>
+    </w:p>
+    <w:p>
+      <w:pPr>
+        <w:pStyle w:val="Heading1"/>
+      </w:pPr>
+      <w:r>
+        <w:rPr>
+          <w:rFonts w:ascii="Times New Roman" w:hAnsi="Times New Roman" w:eastAsia="Times New Roman"/>
+          <w:b/>
+          <w:color w:val="000000"/>
+          <w:sz w:val="32"/>
+        </w:rPr>
+        <w:t>15. Списание (III категория и расходники)</w:t>
+      </w:r>
+    </w:p>
+    <w:p>
+      <w:pPr>
+        <w:spacing w:after="120"/>
+        <w:ind w:firstLine="709"/>
+        <w:jc w:val="both"/>
+      </w:pPr>
+      <w:r>
+        <w:rPr>
+          <w:rFonts w:ascii="Times New Roman" w:hAnsi="Times New Roman" w:eastAsia="Times New Roman"/>
+          <w:b w:val="0"/>
+          <w:color w:val="000000"/>
+          <w:sz w:val="24"/>
+        </w:rPr>
+        <w:t>III категория подлежит списанию: отделить от годного → комиссия по приказу → акт → проводки в книгах → ремонт/ветошь/утилизация по правилам. Расходники списываются прямым расходом. Подменный фонд из непригодного не формировать. Детали ДСП-порядка списания в методичке не воспроизводятся.</w:t>
+      </w:r>
+    </w:p>
+    <w:p>
+      <w:r>
+        <w:drawing>
+          <wp:inline xmlns:a="http://schemas.openxmlformats.org/drawingml/2006/main" xmlns:pic="http://schemas.openxmlformats.org/drawingml/2006/picture">
+            <wp:extent cx="5669280" cy="3968496"/>
+            <wp:docPr id="11" name="Picture 11"/>
+            <wp:cNvGraphicFramePr>
+              <a:graphicFrameLocks noChangeAspect="1"/>
+            </wp:cNvGraphicFramePr>
+            <a:graphic>
+              <a:graphicData uri="http://schemas.openxmlformats.org/drawingml/2006/picture">
+                <pic:pic>
+                  <pic:nvPicPr>
+                    <pic:cNvPr id="0" name="09_spisanie.png"/>
+                    <pic:cNvPicPr/>
+                  </pic:nvPicPr>
+                  <pic:blipFill>
+                    <a:blip r:embed="rId19"/>
+                    <a:stretch>
+                      <a:fillRect/>
+                    </a:stretch>
+                  </pic:blipFill>
+                  <pic:spPr>
+                    <a:xfrm>
+                      <a:off x="0" y="0"/>
+                      <a:ext cx="5669280" cy="3968496"/>
+                    </a:xfrm>
+                    <a:prstGeom prst="rect"/>
+                  </pic:spPr>
+                </pic:pic>
+              </a:graphicData>
+            </a:graphic>
+          </wp:inline>
+        </w:drawing>
+      </w:r>
+    </w:p>
+    <w:p>
+      <w:pPr>
+        <w:jc w:val="center"/>
+      </w:pPr>
+      <w:r>
+        <w:rPr>
+          <w:rFonts w:ascii="Times New Roman" w:hAnsi="Times New Roman" w:eastAsia="Times New Roman"/>
+          <w:b w:val="0"/>
+          <w:i/>
+          <w:color w:val="000000"/>
+          <w:sz w:val="20"/>
+        </w:rPr>
+        <w:t>Рисунок 11. Учебная схема списания</w:t>
+      </w:r>
+    </w:p>
+    <w:p>
+      <w:pPr>
+        <w:pStyle w:val="Heading1"/>
+      </w:pPr>
+      <w:r>
+        <w:rPr>
+          <w:rFonts w:ascii="Times New Roman" w:hAnsi="Times New Roman" w:eastAsia="Times New Roman"/>
+          <w:b/>
+          <w:color w:val="000000"/>
+          <w:sz w:val="32"/>
+        </w:rPr>
+        <w:t>16. Приём-сдача дел</w:t>
+      </w:r>
+    </w:p>
+    <w:p>
+      <w:pPr>
+        <w:pStyle w:val="ListBullet"/>
+      </w:pPr>
+      <w:r>
+        <w:rPr>
+          <w:rFonts w:ascii="Times New Roman" w:hAnsi="Times New Roman" w:eastAsia="Times New Roman"/>
+          <w:b w:val="0"/>
+          <w:color w:val="000000"/>
+          <w:sz w:val="24"/>
+        </w:rPr>
+        <w:t>Приказ о приёме-сдаче; при необходимости — комиссия.</w:t>
+      </w:r>
+    </w:p>
+    <w:p>
+      <w:pPr>
+        <w:pStyle w:val="ListBullet"/>
+      </w:pPr>
+      <w:r>
+        <w:rPr>
+          <w:rFonts w:ascii="Times New Roman" w:hAnsi="Times New Roman" w:eastAsia="Times New Roman"/>
+          <w:b w:val="0"/>
+          <w:color w:val="000000"/>
+          <w:sz w:val="24"/>
+        </w:rPr>
+        <w:t>Сверка книг с наличием и ярлыками ф. 64.</w:t>
+      </w:r>
+    </w:p>
+    <w:p>
+      <w:pPr>
+        <w:pStyle w:val="ListBullet"/>
+      </w:pPr>
+      <w:r>
+        <w:rPr>
+          <w:rFonts w:ascii="Times New Roman" w:hAnsi="Times New Roman" w:eastAsia="Times New Roman"/>
+          <w:b w:val="0"/>
+          <w:color w:val="000000"/>
+          <w:sz w:val="24"/>
+        </w:rPr>
+        <w:t>Проверка НЗ и актов ф. 10, журнала Т/φ, ПБ и охраны.</w:t>
+      </w:r>
+    </w:p>
+    <w:p>
+      <w:pPr>
+        <w:pStyle w:val="ListBullet"/>
+      </w:pPr>
+      <w:r>
+        <w:rPr>
+          <w:rFonts w:ascii="Times New Roman" w:hAnsi="Times New Roman" w:eastAsia="Times New Roman"/>
+          <w:b w:val="0"/>
+          <w:color w:val="000000"/>
+          <w:sz w:val="24"/>
+        </w:rPr>
+        <w:t>Акт приёма-сдачи; передача ключей и слепков; разбор недостач отдельно.</w:t>
+      </w:r>
+    </w:p>
+    <w:p>
+      <w:pPr>
+        <w:pStyle w:val="Heading1"/>
+      </w:pPr>
+      <w:r>
+        <w:rPr>
+          <w:rFonts w:ascii="Times New Roman" w:hAnsi="Times New Roman" w:eastAsia="Times New Roman"/>
+          <w:b/>
+          <w:color w:val="000000"/>
+          <w:sz w:val="32"/>
+        </w:rPr>
+        <w:t>17. Шпаргалка документов</w:t>
+      </w:r>
+    </w:p>
+    <w:p>
+      <w:r>
+        <w:drawing>
+          <wp:inline xmlns:a="http://schemas.openxmlformats.org/drawingml/2006/main" xmlns:pic="http://schemas.openxmlformats.org/drawingml/2006/picture">
+            <wp:extent cx="5669280" cy="4454434"/>
+            <wp:docPr id="12" name="Picture 12"/>
+            <wp:cNvGraphicFramePr>
+              <a:graphicFrameLocks noChangeAspect="1"/>
+            </wp:cNvGraphicFramePr>
+            <a:graphic>
+              <a:graphicData uri="http://schemas.openxmlformats.org/drawingml/2006/picture">
+                <pic:pic>
+                  <pic:nvPicPr>
+                    <pic:cNvPr id="0" name="11_kakoy_dokument.png"/>
+                    <pic:cNvPicPr/>
+                  </pic:nvPicPr>
+                  <pic:blipFill>
+                    <a:blip r:embed="rId20"/>
+                    <a:stretch>
+                      <a:fillRect/>
+                    </a:stretch>
+                  </pic:blipFill>
+                  <pic:spPr>
+                    <a:xfrm>
+                      <a:off x="0" y="0"/>
+                      <a:ext cx="5669280" cy="4454434"/>
+                    </a:xfrm>
+                    <a:prstGeom prst="rect"/>
+                  </pic:spPr>
+                </pic:pic>
+              </a:graphicData>
+            </a:graphic>
+          </wp:inline>
+        </w:drawing>
+      </w:r>
+    </w:p>
+    <w:p>
+      <w:pPr>
+        <w:jc w:val="center"/>
+      </w:pPr>
+      <w:r>
+        <w:rPr>
+          <w:rFonts w:ascii="Times New Roman" w:hAnsi="Times New Roman" w:eastAsia="Times New Roman"/>
+          <w:b w:val="0"/>
+          <w:i/>
+          <w:color w:val="000000"/>
+          <w:sz w:val="20"/>
+        </w:rPr>
+        <w:t>Рисунок 12. Какой документ — на какую операцию</w:t>
+      </w:r>
+    </w:p>
+    <w:p>
+      <w:pPr>
+        <w:pStyle w:val="Heading1"/>
+      </w:pPr>
+      <w:r>
+        <w:rPr>
+          <w:rFonts w:ascii="Times New Roman" w:hAnsi="Times New Roman" w:eastAsia="Times New Roman"/>
+          <w:b/>
+          <w:color w:val="000000"/>
+          <w:sz w:val="32"/>
+        </w:rPr>
+        <w:t>18. Источники</w:t>
       </w:r>
     </w:p>
     <w:p>

</xml_diff>

<commit_message>
Complete clothing service guide: requests, season, repair, norms, 2024-25
Add remaining open-source chapters: report-request cycle, seasonal turn-in,
atelier/repair, stock norms, special norms index, MoD security, equipment,
book entry samples, and 2024-2025 regulatory updates; refresh Word and zip.

Co-authored-by: Aurora Dev <spawnwin@users.noreply.github.com>
</commit_message>
<xml_diff>
--- a/press/veshchevaya-metodichka/docx/Metodichka_veshchevaya_sluzhba_VS_RF.docx
+++ b/press/veshchevaya-metodichka/docx/Metodichka_veshchevaya_sluzhba_VS_RF.docx
@@ -1617,7 +1617,169 @@
           <w:color w:val="000000"/>
           <w:sz w:val="32"/>
         </w:rPr>
-        <w:t>18. Источники</w:t>
+        <w:t>18. Отчёт-заявка и истребование</w:t>
+      </w:r>
+    </w:p>
+    <w:p>
+      <w:pPr>
+        <w:spacing w:after="120"/>
+        <w:ind w:firstLine="709"/>
+        <w:jc w:val="both"/>
+      </w:pPr>
+      <w:r>
+        <w:rPr>
+          <w:rFonts w:ascii="Times New Roman" w:hAnsi="Times New Roman" w:eastAsia="Times New Roman"/>
+          <w:b w:val="0"/>
+          <w:color w:val="000000"/>
+          <w:sz w:val="24"/>
+        </w:rPr>
+        <w:t>Отчёт-заявку утверждает командир части; на её основе довольствующий орган формирует план обеспечения и наряды на отпуск с ЦМТО по ростовке. В обеспеченность входят новое имущество, бывшее в употреблении с неистекшим в периоде сроком и годный инвентарь после срока.</w:t>
+      </w:r>
+    </w:p>
+    <w:p>
+      <w:r>
+        <w:drawing>
+          <wp:inline xmlns:a="http://schemas.openxmlformats.org/drawingml/2006/main" xmlns:pic="http://schemas.openxmlformats.org/drawingml/2006/picture">
+            <wp:extent cx="5669280" cy="3320578"/>
+            <wp:docPr id="13" name="Picture 13"/>
+            <wp:cNvGraphicFramePr>
+              <a:graphicFrameLocks noChangeAspect="1"/>
+            </wp:cNvGraphicFramePr>
+            <a:graphic>
+              <a:graphicData uri="http://schemas.openxmlformats.org/drawingml/2006/picture">
+                <pic:pic>
+                  <pic:nvPicPr>
+                    <pic:cNvPr id="0" name="13_otchet_zayavka.png"/>
+                    <pic:cNvPicPr/>
+                  </pic:nvPicPr>
+                  <pic:blipFill>
+                    <a:blip r:embed="rId21"/>
+                    <a:stretch>
+                      <a:fillRect/>
+                    </a:stretch>
+                  </pic:blipFill>
+                  <pic:spPr>
+                    <a:xfrm>
+                      <a:off x="0" y="0"/>
+                      <a:ext cx="5669280" cy="3320578"/>
+                    </a:xfrm>
+                    <a:prstGeom prst="rect"/>
+                  </pic:spPr>
+                </pic:pic>
+              </a:graphicData>
+            </a:graphic>
+          </wp:inline>
+        </w:drawing>
+      </w:r>
+    </w:p>
+    <w:p>
+      <w:pPr>
+        <w:jc w:val="center"/>
+      </w:pPr>
+      <w:r>
+        <w:rPr>
+          <w:rFonts w:ascii="Times New Roman" w:hAnsi="Times New Roman" w:eastAsia="Times New Roman"/>
+          <w:b w:val="0"/>
+          <w:i/>
+          <w:color w:val="000000"/>
+          <w:sz w:val="20"/>
+        </w:rPr>
+        <w:t>Рисунок 13. Цикл отчёта-заявки</w:t>
+      </w:r>
+    </w:p>
+    <w:p>
+      <w:pPr>
+        <w:pStyle w:val="Heading1"/>
+      </w:pPr>
+      <w:r>
+        <w:rPr>
+          <w:rFonts w:ascii="Times New Roman" w:hAnsi="Times New Roman" w:eastAsia="Times New Roman"/>
+          <w:b/>
+          <w:color w:val="000000"/>
+          <w:sz w:val="32"/>
+        </w:rPr>
+        <w:t>19. Сезонная сдача</w:t>
+      </w:r>
+    </w:p>
+    <w:p>
+      <w:pPr>
+        <w:spacing w:after="120"/>
+        <w:ind w:firstLine="709"/>
+        <w:jc w:val="both"/>
+      </w:pPr>
+      <w:r>
+        <w:rPr>
+          <w:rFonts w:ascii="Times New Roman" w:hAnsi="Times New Roman" w:eastAsia="Times New Roman"/>
+          <w:b w:val="0"/>
+          <w:color w:val="000000"/>
+          <w:sz w:val="24"/>
+        </w:rPr>
+        <w:t>По окончании зимы тёплые вещи и постовая одежда сдаются на склад: обновление клеймения, сортировка, ремонт/химчистка, хранение до сезона. Палатки просушивают и сдают с отметкой сроков в паспортах.</w:t>
+      </w:r>
+    </w:p>
+    <w:p>
+      <w:r>
+        <w:drawing>
+          <wp:inline xmlns:a="http://schemas.openxmlformats.org/drawingml/2006/main" xmlns:pic="http://schemas.openxmlformats.org/drawingml/2006/picture">
+            <wp:extent cx="5669280" cy="3644537"/>
+            <wp:docPr id="14" name="Picture 14"/>
+            <wp:cNvGraphicFramePr>
+              <a:graphicFrameLocks noChangeAspect="1"/>
+            </wp:cNvGraphicFramePr>
+            <a:graphic>
+              <a:graphicData uri="http://schemas.openxmlformats.org/drawingml/2006/picture">
+                <pic:pic>
+                  <pic:nvPicPr>
+                    <pic:cNvPr id="0" name="14_sezon_sdacha.png"/>
+                    <pic:cNvPicPr/>
+                  </pic:nvPicPr>
+                  <pic:blipFill>
+                    <a:blip r:embed="rId22"/>
+                    <a:stretch>
+                      <a:fillRect/>
+                    </a:stretch>
+                  </pic:blipFill>
+                  <pic:spPr>
+                    <a:xfrm>
+                      <a:off x="0" y="0"/>
+                      <a:ext cx="5669280" cy="3644537"/>
+                    </a:xfrm>
+                    <a:prstGeom prst="rect"/>
+                  </pic:spPr>
+                </pic:pic>
+              </a:graphicData>
+            </a:graphic>
+          </wp:inline>
+        </w:drawing>
+      </w:r>
+    </w:p>
+    <w:p>
+      <w:pPr>
+        <w:jc w:val="center"/>
+      </w:pPr>
+      <w:r>
+        <w:rPr>
+          <w:rFonts w:ascii="Times New Roman" w:hAnsi="Times New Roman" w:eastAsia="Times New Roman"/>
+          <w:b w:val="0"/>
+          <w:i/>
+          <w:color w:val="000000"/>
+          <w:sz w:val="20"/>
+        </w:rPr>
+        <w:t>Рисунок 14. Сезонный цикл</w:t>
+      </w:r>
+    </w:p>
+    <w:p>
+      <w:pPr>
+        <w:pStyle w:val="Heading1"/>
+      </w:pPr>
+      <w:r>
+        <w:rPr>
+          <w:rFonts w:ascii="Times New Roman" w:hAnsi="Times New Roman" w:eastAsia="Times New Roman"/>
+          <w:b/>
+          <w:color w:val="000000"/>
+          <w:sz w:val="32"/>
+        </w:rPr>
+        <w:t>20. Ремонт, ателье, комнаты БО, техсредства</w:t>
       </w:r>
     </w:p>
     <w:p>
@@ -1631,7 +1793,7 @@
           <w:color w:val="000000"/>
           <w:sz w:val="24"/>
         </w:rPr>
-        <w:t>ФЗ № 76-ФЗ; ПП РФ № 390; Распоряжение Правительства РФ № 1014-р.</w:t>
+        <w:t>Ателье: ордер на пошив по карточке личного пользования.</w:t>
       </w:r>
     </w:p>
     <w:p>
@@ -1645,7 +1807,351 @@
           <w:color w:val="000000"/>
           <w:sz w:val="24"/>
         </w:rPr>
-        <w:t>Приказы МО РФ № 500, № 139, № 170 (ИД-2017), № 367.</w:t>
+        <w:t>Мастерская: наряд на ремонт в 2 экз., книга учёта ремонта.</w:t>
+      </w:r>
+    </w:p>
+    <w:p>
+      <w:pPr>
+        <w:pStyle w:val="ListBullet"/>
+      </w:pPr>
+      <w:r>
+        <w:rPr>
+          <w:rFonts w:ascii="Times New Roman" w:hAnsi="Times New Roman" w:eastAsia="Times New Roman"/>
+          <w:b w:val="0"/>
+          <w:color w:val="000000"/>
+          <w:sz w:val="24"/>
+        </w:rPr>
+        <w:t>Комнаты БО: контроль укомплектования ремонтными материалами.</w:t>
+      </w:r>
+    </w:p>
+    <w:p>
+      <w:pPr>
+        <w:pStyle w:val="ListBullet"/>
+      </w:pPr>
+      <w:r>
+        <w:rPr>
+          <w:rFonts w:ascii="Times New Roman" w:hAnsi="Times New Roman" w:eastAsia="Times New Roman"/>
+          <w:b w:val="0"/>
+          <w:color w:val="000000"/>
+          <w:sz w:val="24"/>
+        </w:rPr>
+        <w:t>Техсредства: учёт, ТО, запчасти по нормам № 42–43.</w:t>
+      </w:r>
+    </w:p>
+    <w:p>
+      <w:r>
+        <w:drawing>
+          <wp:inline xmlns:a="http://schemas.openxmlformats.org/drawingml/2006/main" xmlns:pic="http://schemas.openxmlformats.org/drawingml/2006/picture">
+            <wp:extent cx="5669280" cy="3644537"/>
+            <wp:docPr id="15" name="Picture 15"/>
+            <wp:cNvGraphicFramePr>
+              <a:graphicFrameLocks noChangeAspect="1"/>
+            </wp:cNvGraphicFramePr>
+            <a:graphic>
+              <a:graphicData uri="http://schemas.openxmlformats.org/drawingml/2006/picture">
+                <pic:pic>
+                  <pic:nvPicPr>
+                    <pic:cNvPr id="0" name="15_remont_atele.png"/>
+                    <pic:cNvPicPr/>
+                  </pic:nvPicPr>
+                  <pic:blipFill>
+                    <a:blip r:embed="rId23"/>
+                    <a:stretch>
+                      <a:fillRect/>
+                    </a:stretch>
+                  </pic:blipFill>
+                  <pic:spPr>
+                    <a:xfrm>
+                      <a:off x="0" y="0"/>
+                      <a:ext cx="5669280" cy="3644537"/>
+                    </a:xfrm>
+                    <a:prstGeom prst="rect"/>
+                  </pic:spPr>
+                </pic:pic>
+              </a:graphicData>
+            </a:graphic>
+          </wp:inline>
+        </w:drawing>
+      </w:r>
+    </w:p>
+    <w:p>
+      <w:pPr>
+        <w:jc w:val="center"/>
+      </w:pPr>
+      <w:r>
+        <w:rPr>
+          <w:rFonts w:ascii="Times New Roman" w:hAnsi="Times New Roman" w:eastAsia="Times New Roman"/>
+          <w:b w:val="0"/>
+          <w:i/>
+          <w:color w:val="000000"/>
+          <w:sz w:val="20"/>
+        </w:rPr>
+        <w:t>Рисунок 15. Ремонт и ателье</w:t>
+      </w:r>
+    </w:p>
+    <w:p>
+      <w:pPr>
+        <w:pStyle w:val="Heading1"/>
+      </w:pPr>
+      <w:r>
+        <w:rPr>
+          <w:rFonts w:ascii="Times New Roman" w:hAnsi="Times New Roman" w:eastAsia="Times New Roman"/>
+          <w:b/>
+          <w:color w:val="000000"/>
+          <w:sz w:val="32"/>
+        </w:rPr>
+        <w:t>21. Запасы, спецнормы, охрана МО, изменения</w:t>
+      </w:r>
+    </w:p>
+    <w:p>
+      <w:pPr>
+        <w:pStyle w:val="ListBullet"/>
+      </w:pPr>
+      <w:r>
+        <w:rPr>
+          <w:rFonts w:ascii="Times New Roman" w:hAnsi="Times New Roman" w:eastAsia="Times New Roman"/>
+          <w:b w:val="0"/>
+          <w:color w:val="000000"/>
+          <w:sz w:val="24"/>
+        </w:rPr>
+        <w:t>Прил. № 2–3 к № 500 — переходящие/страховые запасы и нормы содержания.</w:t>
+      </w:r>
+    </w:p>
+    <w:p>
+      <w:pPr>
+        <w:pStyle w:val="ListBullet"/>
+      </w:pPr>
+      <w:r>
+        <w:rPr>
+          <w:rFonts w:ascii="Times New Roman" w:hAnsi="Times New Roman" w:eastAsia="Times New Roman"/>
+          <w:b w:val="0"/>
+          <w:color w:val="000000"/>
+          <w:sz w:val="24"/>
+        </w:rPr>
+        <w:t>Прил. № 4 — спецнормы № 1–45 (указатель); женская ростовка — отдельно.</w:t>
+      </w:r>
+    </w:p>
+    <w:p>
+      <w:pPr>
+        <w:pStyle w:val="ListBullet"/>
+      </w:pPr>
+      <w:r>
+        <w:rPr>
+          <w:rFonts w:ascii="Times New Roman" w:hAnsi="Times New Roman" w:eastAsia="Times New Roman"/>
+          <w:b w:val="0"/>
+          <w:color w:val="000000"/>
+          <w:sz w:val="24"/>
+        </w:rPr>
+        <w:t>Прил. № 5 — ведомственная охрана МО.</w:t>
+      </w:r>
+    </w:p>
+    <w:p>
+      <w:pPr>
+        <w:pStyle w:val="ListBullet"/>
+      </w:pPr>
+      <w:r>
+        <w:rPr>
+          <w:rFonts w:ascii="Times New Roman" w:hAnsi="Times New Roman" w:eastAsia="Times New Roman"/>
+          <w:b w:val="0"/>
+          <w:color w:val="000000"/>
+          <w:sz w:val="24"/>
+        </w:rPr>
+        <w:t>Приказ № 367/2024 и ПП № 1116/2025 — сверять перед выдачей.</w:t>
+      </w:r>
+    </w:p>
+    <w:p>
+      <w:r>
+        <w:drawing>
+          <wp:inline xmlns:a="http://schemas.openxmlformats.org/drawingml/2006/main" xmlns:pic="http://schemas.openxmlformats.org/drawingml/2006/picture">
+            <wp:extent cx="5669280" cy="4859383"/>
+            <wp:docPr id="16" name="Picture 16"/>
+            <wp:cNvGraphicFramePr>
+              <a:graphicFrameLocks noChangeAspect="1"/>
+            </wp:cNvGraphicFramePr>
+            <a:graphic>
+              <a:graphicData uri="http://schemas.openxmlformats.org/drawingml/2006/picture">
+                <pic:pic>
+                  <pic:nvPicPr>
+                    <pic:cNvPr id="0" name="16_specnormy.png"/>
+                    <pic:cNvPicPr/>
+                  </pic:nvPicPr>
+                  <pic:blipFill>
+                    <a:blip r:embed="rId24"/>
+                    <a:stretch>
+                      <a:fillRect/>
+                    </a:stretch>
+                  </pic:blipFill>
+                  <pic:spPr>
+                    <a:xfrm>
+                      <a:off x="0" y="0"/>
+                      <a:ext cx="5669280" cy="4859383"/>
+                    </a:xfrm>
+                    <a:prstGeom prst="rect"/>
+                  </pic:spPr>
+                </pic:pic>
+              </a:graphicData>
+            </a:graphic>
+          </wp:inline>
+        </w:drawing>
+      </w:r>
+    </w:p>
+    <w:p>
+      <w:pPr>
+        <w:jc w:val="center"/>
+      </w:pPr>
+      <w:r>
+        <w:rPr>
+          <w:rFonts w:ascii="Times New Roman" w:hAnsi="Times New Roman" w:eastAsia="Times New Roman"/>
+          <w:b w:val="0"/>
+          <w:i/>
+          <w:color w:val="000000"/>
+          <w:sz w:val="20"/>
+        </w:rPr>
+        <w:t>Рисунок 16. Указатель спецнорм</w:t>
+      </w:r>
+    </w:p>
+    <w:p>
+      <w:r>
+        <w:drawing>
+          <wp:inline xmlns:a="http://schemas.openxmlformats.org/drawingml/2006/main" xmlns:pic="http://schemas.openxmlformats.org/drawingml/2006/picture">
+            <wp:extent cx="5669280" cy="4049486"/>
+            <wp:docPr id="17" name="Picture 17"/>
+            <wp:cNvGraphicFramePr>
+              <a:graphicFrameLocks noChangeAspect="1"/>
+            </wp:cNvGraphicFramePr>
+            <a:graphic>
+              <a:graphicData uri="http://schemas.openxmlformats.org/drawingml/2006/picture">
+                <pic:pic>
+                  <pic:nvPicPr>
+                    <pic:cNvPr id="0" name="17_obrazcy_zapisey.png"/>
+                    <pic:cNvPicPr/>
+                  </pic:nvPicPr>
+                  <pic:blipFill>
+                    <a:blip r:embed="rId25"/>
+                    <a:stretch>
+                      <a:fillRect/>
+                    </a:stretch>
+                  </pic:blipFill>
+                  <pic:spPr>
+                    <a:xfrm>
+                      <a:off x="0" y="0"/>
+                      <a:ext cx="5669280" cy="4049486"/>
+                    </a:xfrm>
+                    <a:prstGeom prst="rect"/>
+                  </pic:spPr>
+                </pic:pic>
+              </a:graphicData>
+            </a:graphic>
+          </wp:inline>
+        </w:drawing>
+      </w:r>
+    </w:p>
+    <w:p>
+      <w:pPr>
+        <w:jc w:val="center"/>
+      </w:pPr>
+      <w:r>
+        <w:rPr>
+          <w:rFonts w:ascii="Times New Roman" w:hAnsi="Times New Roman" w:eastAsia="Times New Roman"/>
+          <w:b w:val="0"/>
+          <w:i/>
+          <w:color w:val="000000"/>
+          <w:sz w:val="20"/>
+        </w:rPr>
+        <w:t>Рисунок 17. Образцы записей в книгах</w:t>
+      </w:r>
+    </w:p>
+    <w:p>
+      <w:r>
+        <w:drawing>
+          <wp:inline xmlns:a="http://schemas.openxmlformats.org/drawingml/2006/main" xmlns:pic="http://schemas.openxmlformats.org/drawingml/2006/picture">
+            <wp:extent cx="5669280" cy="3239589"/>
+            <wp:docPr id="18" name="Picture 18"/>
+            <wp:cNvGraphicFramePr>
+              <a:graphicFrameLocks noChangeAspect="1"/>
+            </wp:cNvGraphicFramePr>
+            <a:graphic>
+              <a:graphicData uri="http://schemas.openxmlformats.org/drawingml/2006/picture">
+                <pic:pic>
+                  <pic:nvPicPr>
+                    <pic:cNvPr id="0" name="18_izmeneniya_2024_2025.png"/>
+                    <pic:cNvPicPr/>
+                  </pic:nvPicPr>
+                  <pic:blipFill>
+                    <a:blip r:embed="rId26"/>
+                    <a:stretch>
+                      <a:fillRect/>
+                    </a:stretch>
+                  </pic:blipFill>
+                  <pic:spPr>
+                    <a:xfrm>
+                      <a:off x="0" y="0"/>
+                      <a:ext cx="5669280" cy="3239589"/>
+                    </a:xfrm>
+                    <a:prstGeom prst="rect"/>
+                  </pic:spPr>
+                </pic:pic>
+              </a:graphicData>
+            </a:graphic>
+          </wp:inline>
+        </w:drawing>
+      </w:r>
+    </w:p>
+    <w:p>
+      <w:pPr>
+        <w:jc w:val="center"/>
+      </w:pPr>
+      <w:r>
+        <w:rPr>
+          <w:rFonts w:ascii="Times New Roman" w:hAnsi="Times New Roman" w:eastAsia="Times New Roman"/>
+          <w:b w:val="0"/>
+          <w:i/>
+          <w:color w:val="000000"/>
+          <w:sz w:val="20"/>
+        </w:rPr>
+        <w:t>Рисунок 18. Изменения 2024–2025</w:t>
+      </w:r>
+    </w:p>
+    <w:p>
+      <w:pPr>
+        <w:pStyle w:val="Heading1"/>
+      </w:pPr>
+      <w:r>
+        <w:rPr>
+          <w:rFonts w:ascii="Times New Roman" w:hAnsi="Times New Roman" w:eastAsia="Times New Roman"/>
+          <w:b/>
+          <w:color w:val="000000"/>
+          <w:sz w:val="32"/>
+        </w:rPr>
+        <w:t>22. Источники</w:t>
+      </w:r>
+    </w:p>
+    <w:p>
+      <w:pPr>
+        <w:pStyle w:val="ListBullet"/>
+      </w:pPr>
+      <w:r>
+        <w:rPr>
+          <w:rFonts w:ascii="Times New Roman" w:hAnsi="Times New Roman" w:eastAsia="Times New Roman"/>
+          <w:b w:val="0"/>
+          <w:color w:val="000000"/>
+          <w:sz w:val="24"/>
+        </w:rPr>
+        <w:t>ФЗ № 76-ФЗ; ПП РФ № 390 (изм. ПП № 1116); Распоряжение № 1014-р.</w:t>
+      </w:r>
+    </w:p>
+    <w:p>
+      <w:pPr>
+        <w:pStyle w:val="ListBullet"/>
+      </w:pPr>
+      <w:r>
+        <w:rPr>
+          <w:rFonts w:ascii="Times New Roman" w:hAnsi="Times New Roman" w:eastAsia="Times New Roman"/>
+          <w:b w:val="0"/>
+          <w:color w:val="000000"/>
+          <w:sz w:val="24"/>
+        </w:rPr>
+        <w:t>Приказы МО РФ № 500, № 367, № 139, № 170 (ИД-2017), № 333.</w:t>
       </w:r>
     </w:p>
     <w:p>
@@ -1673,7 +2179,7 @@
           <w:color w:val="000000"/>
           <w:sz w:val="24"/>
         </w:rPr>
-        <w:t>Инструкция по хранению вещевого имущества (открытые переизложения / учебные материалы).</w:t>
+        <w:t>Инструкция по хранению вещевого имущества (открытые переизложения).</w:t>
       </w:r>
     </w:p>
     <w:p>
@@ -1687,7 +2193,7 @@
           <w:color w:val="000000"/>
           <w:sz w:val="24"/>
         </w:rPr>
-        <w:t>Открытые методические материалы по учёту имущества в подразделении (ф. 26, 37, 45).</w:t>
+        <w:t>Открытые материалы по учёту имущества в подразделении (ф. 26, 37, 45).</w:t>
       </w:r>
     </w:p>
     <w:p>

</xml_diff>